<commit_message>
Marcius Melhem: revisão da Parte 5
Co-Authored-By: Claude Opus 5.5 <noreply@anthropic.com>
Claude-Session: https://claude.ai/code/session_01MJjUEEZrxQDEUifKK2vj9g
</commit_message>
<xml_diff>
--- a/roteiros/marcius-melhem/Melhem_Parte5.docx
+++ b/roteiros/marcius-melhem/Melhem_Parte5.docx
@@ -39,7 +39,7 @@
         <w:rPr>
           <w:color w:val="000000"/>
         </w:rPr>
-        <w:t>O Ministério Público do Rio de Janeiro fez a Marcius Melhem uma proposta para encerrar a última acusação que ainda restava contra ele.</w:t>
+        <w:t>Naquele dia, Marcius Melhem aceitou uma proposta do Ministério Público do Rio de Janeiro para encerrar a última acusação que ainda restava contra ele.</w:t>
       </w:r>
     </w:p>
     <w:p>
@@ -55,7 +55,7 @@
         <w:rPr>
           <w:color w:val="000000"/>
         </w:rPr>
-        <w:t>Funciona assim. Em crimes com pena menor, como o assédio sexual, o Ministério Público pode oferecer ao acusado um acordo. Em vez de enfrentar um julgamento, ele cumpre uma medida alternativa, como pagar um valor a uma instituição de caridade. Com isso, o processo acaba.</w:t>
+        <w:t>Funciona assim. Em crimes com pena menor, como o assédio sexual, o Ministério Público pode oferecer ao acusado um acordo. Em vez de enfrentar um julgamento, ele cumpre uma medida alternativa, como pagar um valor a uma instituição de caridade.</w:t>
       </w:r>
     </w:p>
     <w:p>
@@ -63,15 +63,7 @@
         <w:rPr>
           <w:color w:val="000000"/>
         </w:rPr>
-        <w:t>O processo termina sem condenação e sem absolvição. O acusado não fica com ficha criminal, e o acordo não representa admissão de culpa.</w:t>
-      </w:r>
-    </w:p>
-    <w:p>
-      <w:r>
-        <w:rPr>
-          <w:color w:val="000000"/>
-        </w:rPr>
-        <w:t>Melhem aceitou.</w:t>
+        <w:t>Com isso, o processo termina sem condenação e sem absolvição. O acusado não fica com ficha criminal, e o acordo não representa admissão de culpa.</w:t>
       </w:r>
     </w:p>
     <w:p>
@@ -207,7 +199,7 @@
         <w:rPr>
           <w:color w:val="000000"/>
         </w:rPr>
-        <w:t>É assim que essa história termina na Justiça criminal. Sem julgamento. Sem um juiz dizendo se aquilo aconteceu ou não aconteceu.</w:t>
+        <w:t>É assim que termina o processo por assédio sexual. Sem julgamento. Sem um juiz dizendo se aquilo aconteceu ou não aconteceu.</w:t>
       </w:r>
     </w:p>
     <w:p>
@@ -231,7 +223,7 @@
         <w:rPr>
           <w:color w:val="000000"/>
         </w:rPr>
-        <w:t>Essa é a versão dele. E, diante da lei, ele é um homem que nunca foi condenado por nada.</w:t>
+        <w:t>Essa é a versão dele. E, diante da lei, ele nunca foi condenado por nenhuma dessas acusações.</w:t>
       </w:r>
     </w:p>
     <w:p>
@@ -247,7 +239,7 @@
         <w:rPr>
           <w:color w:val="C00000"/>
         </w:rPr>
-        <w:t>Mas essa história ainda tem uma última ponta solta. Lembra das mensagens que Melhem mostrou na televisão, e dos mais de cem vídeos que ele gravou para se defender? Pois foi justamente aí que nasceu o processo que ainda está aberto.</w:t>
+        <w:t>Mas essa história ainda tem uma última ponta solta. As mensagens que Melhem mostrou na televisão foram a primeira arma da defesa dele. Depois vieram os mais de cem vídeos no YouTube. E foi justamente desses vídeos que nasceu o processo que ainda está aberto.</w:t>
       </w:r>
     </w:p>
     <w:p>

</xml_diff>

<commit_message>
Marcius Melhem: Parte 5
Co-Authored-By: Claude Opus 5.5 <noreply@anthropic.com>
Claude-Session: https://claude.ai/code/session_01MJjUEEZrxQDEUifKK2vj9g
</commit_message>
<xml_diff>
--- a/roteiros/marcius-melhem/Melhem_Parte5.docx
+++ b/roteiros/marcius-melhem/Melhem_Parte5.docx
@@ -7,7 +7,7 @@
         <w:pStyle w:val="Heading1"/>
       </w:pPr>
       <w:r>
-        <w:t>Assim FOI a VIDA de MARCIUS MELHEM: O Escândalo Que A Globo Não Conseguiu Abafar — Parte 5</w:t>
+        <w:t>MARCIUS MELHEM: O Escândalo Que a Globo Nunca Explicou — Parte 5</w:t>
       </w:r>
     </w:p>
     <w:p>
@@ -15,7 +15,7 @@
         <w:rPr>
           <w:color w:val="000000"/>
         </w:rPr>
-        <w:t>Quinta-feira, vinte e quatro de setembro de dois mil e vinte e seis.</w:t>
+        <w:t>Depois que Marcius Melhem virou réu, o caso entrou numa fase que quase ninguém acompanha.</w:t>
       </w:r>
     </w:p>
     <w:p>
@@ -23,7 +23,7 @@
         <w:rPr>
           <w:color w:val="000000"/>
         </w:rPr>
-        <w:t>Quase seis anos depois da primeira reportagem da piauí.</w:t>
+        <w:t>A fase lenta.</w:t>
       </w:r>
     </w:p>
     <w:p>
@@ -31,7 +31,7 @@
         <w:rPr>
           <w:color w:val="000000"/>
         </w:rPr>
-        <w:t>Nove anos depois daquela festa do Zorra.</w:t>
+        <w:t>Recursos e audiências adiadas. Meses em que nada parece acontecer, enquanto os papéis andam de uma mesa para outra dentro do tribunal.</w:t>
       </w:r>
     </w:p>
     <w:p>
@@ -39,7 +39,7 @@
         <w:rPr>
           <w:color w:val="000000"/>
         </w:rPr>
-        <w:t>Naquele dia, Marcius Melhem aceitou uma proposta do Ministério Público do Rio de Janeiro para encerrar a última acusação que ainda restava contra ele.</w:t>
+        <w:t>Nesse tempo, Melhem decidiu falar com o público de outro jeito.</w:t>
       </w:r>
     </w:p>
     <w:p>
@@ -47,7 +47,7 @@
         <w:rPr>
           <w:color w:val="000000"/>
         </w:rPr>
-        <w:t>Uma proposta que tem um nome técnico. Transação penal.</w:t>
+        <w:t>Em entrevista à Folha de S.Paulo, ainda em dois mil e vinte e três, disse que tinha sido condenado publicamente sem provas. E afirmou que o caso tinha nascido de mágoas e de desejo de vingança.</w:t>
       </w:r>
     </w:p>
     <w:p>
@@ -55,7 +55,7 @@
         <w:rPr>
           <w:color w:val="000000"/>
         </w:rPr>
-        <w:t>Funciona assim. Em crimes com pena menor, como o assédio sexual, o Ministério Público pode oferecer ao acusado um acordo. Em vez de enfrentar um julgamento, ele cumpre uma medida alternativa, como pagar um valor a uma instituição de caridade.</w:t>
+        <w:t>Ele também passou a publicar vídeos na internet respondendo às acusações. Em alguns deles, segundo o que foi publicado depois, mostrava mensagens trocadas com algumas das mulheres que o acusavam.</w:t>
       </w:r>
     </w:p>
     <w:p>
@@ -63,7 +63,15 @@
         <w:rPr>
           <w:color w:val="000000"/>
         </w:rPr>
-        <w:t>Com isso, o processo termina sem condenação e sem absolvição. O acusado não fica com ficha criminal, e o acordo não representa admissão de culpa.</w:t>
+        <w:t>Para ele, era o direito de se defender de acusações feitas em público.</w:t>
+      </w:r>
+    </w:p>
+    <w:p>
+      <w:r>
+        <w:rPr>
+          <w:color w:val="000000"/>
+        </w:rPr>
+        <w:t>Para elas, aqueles vídeos iam virar um novo processo.</w:t>
       </w:r>
     </w:p>
     <w:p>
@@ -71,7 +79,7 @@
         <w:rPr>
           <w:color w:val="C00000"/>
         </w:rPr>
-        <w:t>Agora guarde bem este número. Porque ele é a resposta à pergunta que você ouviu no começo deste vídeo. Como um caso com sete denúncias, duas reportagens, uma censura derrubada no Supremo e um inquérito de duas mil e quatrocentas páginas terminou.</w:t>
+        <w:t>Guarde esses vídeos. Porque foi justamente a forma como Melhem escolheu se defender que acabou colocando o nome dele numa segunda acusação criminal. E, desta vez, Dani Calabresa estava entre as mulheres que o levaram à Justiça.</w:t>
       </w:r>
     </w:p>
     <w:p>
@@ -79,7 +87,7 @@
         <w:rPr>
           <w:color w:val="000000"/>
         </w:rPr>
-        <w:t>O valor do acordo foi de cinco salários mínimos.</w:t>
+        <w:t>Antes disso, porém, veio a reviravolta que ninguém esperava.</w:t>
       </w:r>
     </w:p>
     <w:p>
@@ -87,7 +95,7 @@
         <w:rPr>
           <w:color w:val="000000"/>
         </w:rPr>
-        <w:t>Oito mil, cento e cinco reais.</w:t>
+        <w:t>Maio de dois mil e vinte e cinco.</w:t>
       </w:r>
     </w:p>
     <w:p>
@@ -95,7 +103,7 @@
         <w:rPr>
           <w:color w:val="000000"/>
         </w:rPr>
-        <w:t>O dinheiro foi destinado ao Retiro dos Artistas, uma casa no Rio de Janeiro que, há mais de cem anos, acolhe atores e artistas idosos que não têm mais como se sustentar.</w:t>
+        <w:t>O Ministério Público do Rio de Janeiro, o mesmo órgão que tinha acusado Melhem dois anos antes, pediu à Justiça que o caso de assédio sexual fosse arquivado.</w:t>
       </w:r>
     </w:p>
     <w:p>
@@ -103,7 +111,7 @@
         <w:rPr>
           <w:color w:val="000000"/>
         </w:rPr>
-        <w:t>E existe um detalhe nesse acordo que pouca gente notou.</w:t>
+        <w:t>O motivo apresentado foi o que os juristas chamam de falta de justa causa. Na prática, o Ministério Público dizia que não havia elementos suficientes para seguir com a acusação.</w:t>
       </w:r>
     </w:p>
     <w:p>
@@ -111,7 +119,7 @@
         <w:rPr>
           <w:color w:val="000000"/>
         </w:rPr>
-        <w:t>O Ministério Público tinha proposto três salários mínimos.</w:t>
+        <w:t>Pense no tamanho dessa virada.</w:t>
       </w:r>
     </w:p>
     <w:p>
@@ -119,7 +127,7 @@
         <w:rPr>
           <w:color w:val="000000"/>
         </w:rPr>
-        <w:t>Foi o próprio Melhem quem sugeriu aumentar para cinco. E foi ele quem escolheu a instituição que ia receber o dinheiro.</w:t>
+        <w:t>A acusação estava pedindo para encerrar a própria acusação.</w:t>
       </w:r>
     </w:p>
     <w:p>
@@ -127,7 +135,7 @@
         <w:rPr>
           <w:color w:val="000000"/>
         </w:rPr>
-        <w:t>Oito mil reais.</w:t>
+        <w:t>Para a defesa de Melhem, era a confirmação de tudo o que vinha dizendo desde dois mil e vinte.</w:t>
       </w:r>
     </w:p>
     <w:p>
@@ -135,7 +143,7 @@
         <w:rPr>
           <w:color w:val="000000"/>
         </w:rPr>
-        <w:t>Agora volte a cada objeto desta história.</w:t>
+        <w:t>Só que a palavra final não era do Ministério Público.</w:t>
       </w:r>
     </w:p>
     <w:p>
@@ -143,7 +151,7 @@
         <w:rPr>
           <w:color w:val="000000"/>
         </w:rPr>
-        <w:t>Lembre da cadeira de diretor. Da sala onde se decidia quem ganhava espaço no humor da maior emissora do país.</w:t>
+        <w:t>A juíza Juliana Benevides, a mesma que tinha aceitado a denúncia em dois mil e vinte e três, recusou o pedido de arquivamento.</w:t>
       </w:r>
     </w:p>
     <w:p>
@@ -151,7 +159,15 @@
         <w:rPr>
           <w:color w:val="000000"/>
         </w:rPr>
-        <w:t>Lembre da porta do banheiro, naquela festa de dois mil e dezessete. Do relato que Dani Calabresa levou para dentro da Globo, e que a Justiça nunca chegou a julgar, porque o prazo acabou antes.</w:t>
+        <w:t>O processo continuou.</w:t>
+      </w:r>
+    </w:p>
+    <w:p>
+      <w:r>
+        <w:rPr>
+          <w:color w:val="C00000"/>
+        </w:rPr>
+        <w:t>Dois meses depois, a mesma juíza ia tomar mais uma decisão sobre Marcius Melhem. E, dessa vez, ele não ia estar sozinho no banco dos réus. Ao lado dele ia estar um jornalista.</w:t>
       </w:r>
     </w:p>
     <w:p>
@@ -159,7 +175,7 @@
         <w:rPr>
           <w:color w:val="000000"/>
         </w:rPr>
-        <w:t>Lembre das duas notas da Globo, a de março e a de agosto, que não diziam uma palavra sobre as acusações.</w:t>
+        <w:t>Julho de dois mil e vinte e cinco.</w:t>
       </w:r>
     </w:p>
     <w:p>
@@ -167,7 +183,7 @@
         <w:rPr>
           <w:color w:val="000000"/>
         </w:rPr>
-        <w:t>Lembre dos cento e setenta e dois dias em que uma revista ficou proibida de publicar.</w:t>
+        <w:t>A Justiça do Rio aceitou uma nova denúncia. Marcius Melhem e o jornalista Ricardo Feltrin, o colunista que tinha divulgado as mensagens e entrevistado Melhem em dois mil e vinte e um, passaram a ser réus por violência psicológica e perseguição.</w:t>
       </w:r>
     </w:p>
     <w:p>
@@ -175,7 +191,7 @@
         <w:rPr>
           <w:color w:val="000000"/>
         </w:rPr>
-        <w:t>E lembre das duas mil e quatrocentas páginas do inquérito.</w:t>
+        <w:t>Quem acusava eram quatro mulheres. Dani Calabresa, Carol Portes, Veronica Debom e Renata Ricci.</w:t>
       </w:r>
     </w:p>
     <w:p>
@@ -183,7 +199,7 @@
         <w:rPr>
           <w:color w:val="000000"/>
         </w:rPr>
-        <w:t>Se você dividir oito mil, cento e cinco reais por duas mil e quatrocentas páginas, dá pouco mais de três reais por página.</w:t>
+        <w:t>Segundo a acusação, os dois teriam espalhado publicamente comentários constrangedores e desqualificadores sobre elas. Comentários que, segundo as mulheres, provocaram ondas de ataques e mensagens de ódio nas redes sociais.</w:t>
       </w:r>
     </w:p>
     <w:p>
@@ -191,7 +207,7 @@
         <w:rPr>
           <w:color w:val="000000"/>
         </w:rPr>
-        <w:t>Três reais.</w:t>
+        <w:t>O caso tinha começado em São Paulo e foi transferido para o Rio de Janeiro. Corre em segredo de Justiça.</w:t>
       </w:r>
     </w:p>
     <w:p>
@@ -199,7 +215,7 @@
         <w:rPr>
           <w:color w:val="000000"/>
         </w:rPr>
-        <w:t>É assim que termina o processo por assédio sexual. Sem julgamento. Sem um juiz dizendo se aquilo aconteceu ou não aconteceu.</w:t>
+        <w:t>A defesa de Melhem reagiu. Os advogados afirmaram que aqueles mesmos fatos já tinham sido analisados e arquivados por outro tribunal, depois de uma investigação que incluiu uma perícia feita por quatro peritas criminais. Disseram também que o próprio Ministério Público tinha defendido aquele arquivamento, e que confiavam na absolvição.</w:t>
       </w:r>
     </w:p>
     <w:p>
@@ -207,7 +223,7 @@
         <w:rPr>
           <w:color w:val="000000"/>
         </w:rPr>
-        <w:t>A defesa de Melhem divulgou uma nota. Disse que ele encerrava aquele capítulo como sempre tinha se declarado. Inocente.</w:t>
+        <w:t>Feltrin disse que a acusação era uma tentativa de censura. E afirmou que as mulheres combinavam as versões entre si.</w:t>
       </w:r>
     </w:p>
     <w:p>
@@ -215,7 +231,7 @@
         <w:rPr>
           <w:color w:val="000000"/>
         </w:rPr>
-        <w:t>Ele mesmo voltou a falar em execução pública, desumana, sem provas. E descreveu o processo como uma combinação de ressentimentos e vinganças.</w:t>
+        <w:t>Mais uma vez, cada lado contava uma história que não cabia na história do outro.</w:t>
       </w:r>
     </w:p>
     <w:p>
@@ -223,7 +239,7 @@
         <w:rPr>
           <w:color w:val="000000"/>
         </w:rPr>
-        <w:t>Essa é a versão dele. E, diante da lei, ele nunca foi condenado por nenhuma dessas acusações.</w:t>
+        <w:t>Enquanto isso, o tempo continuava trabalhando no processo principal.</w:t>
       </w:r>
     </w:p>
     <w:p>
@@ -231,7 +247,15 @@
         <w:rPr>
           <w:color w:val="000000"/>
         </w:rPr>
-        <w:t>Do outro lado, ficaram sete mulheres. Seis delas nunca tiveram o próprio relato julgado. A sétima viu o caso terminar num acordo de oito mil reais.</w:t>
+        <w:t>Das três acusações de assédio sexual que tinham transformado Melhem em réu, duas também acabaram prescrevendo. Sobrou apenas um episódio para ser julgado.</w:t>
+      </w:r>
+    </w:p>
+    <w:p>
+      <w:r>
+        <w:rPr>
+          <w:color w:val="000000"/>
+        </w:rPr>
+        <w:t>Quase seis anos depois da reportagem, dos doze casos relatados naquelas páginas, restava apenas um diante da Justiça criminal.</w:t>
       </w:r>
     </w:p>
     <w:p>
@@ -239,7 +263,7 @@
         <w:rPr>
           <w:color w:val="C00000"/>
         </w:rPr>
-        <w:t>Mas essa história ainda tem uma última ponta solta. As mensagens que Melhem mostrou na televisão foram a primeira arma da defesa dele. Depois vieram os mais de cem vídeos no YouTube. E foi justamente desses vídeos que nasceu o processo que ainda está aberto.</w:t>
+        <w:t>E foi exatamente esse último episódio que levou ao desfecho de que falamos lá no começo deste vídeo. Um desfecho que encerrou o processo sem que nenhum juiz dissesse quem estava falando a verdade.</w:t>
       </w:r>
     </w:p>
     <w:p>
@@ -247,7 +271,7 @@
         <w:rPr>
           <w:color w:val="000000"/>
         </w:rPr>
-        <w:t>Enquanto o caso de assédio chegava ao fim, outro processo continuava correndo.</w:t>
+        <w:t>Vinte e quatro de setembro de dois mil e vinte e seis.</w:t>
       </w:r>
     </w:p>
     <w:p>
@@ -255,7 +279,7 @@
         <w:rPr>
           <w:color w:val="000000"/>
         </w:rPr>
-        <w:t>Quatro atrizes acusam Melhem de violência psicológica e perseguição. O motivo, segundo elas, são justamente os vídeos que ele publicou no YouTube ao longo dos anos falando delas.</w:t>
+        <w:t>Numa audiência no Rio de Janeiro, o Ministério Público ofereceu a Marcius Melhem um acordo.</w:t>
       </w:r>
     </w:p>
     <w:p>
@@ -263,7 +287,7 @@
         <w:rPr>
           <w:color w:val="000000"/>
         </w:rPr>
-        <w:t>O homem que dizia estar sendo julgado em praça pública agora responde por aquilo que ele mesmo publicou.</w:t>
+        <w:t>O nome técnico é transação penal.</w:t>
       </w:r>
     </w:p>
     <w:p>
@@ -271,7 +295,7 @@
         <w:rPr>
           <w:color w:val="000000"/>
         </w:rPr>
-        <w:t>Esse capítulo ainda não tem fim.</w:t>
+        <w:t>Funciona assim. Em crimes considerados de menor potencial ofensivo, com pena máxima de até dois anos, a pessoa acusada pode aceitar cumprir uma medida, como pagar um valor a uma instituição. Em troca, o processo é encerrado sem que o juiz analise se a acusação era verdadeira.</w:t>
       </w:r>
     </w:p>
     <w:p>
@@ -279,7 +303,7 @@
         <w:rPr>
           <w:color w:val="000000"/>
         </w:rPr>
-        <w:t>Dani Calabresa seguiu trabalhando. Continuou na televisão, continuou fazendo o Brasil rir. Quando o caso dela prescreveu, ela destacou que, para ela, o assédio tinha sido reconhecido pelo Ministério Público.</w:t>
+        <w:t>Não há condenação. E, pela lei, aceitar o acordo também não significa admitir culpa.</w:t>
       </w:r>
     </w:p>
     <w:p>
@@ -287,7 +311,7 @@
         <w:rPr>
           <w:color w:val="000000"/>
         </w:rPr>
-        <w:t>Marcius Melhem, o homem que um dia teve nas mãos o destino de dezenas de comediantes, terminou essa história longe da emissora onde passou dezessete anos.</w:t>
+        <w:t>O Ministério Público propôs que Melhem pagasse três salários mínimos a uma instituição.</w:t>
       </w:r>
     </w:p>
     <w:p>
@@ -295,7 +319,7 @@
         <w:rPr>
           <w:color w:val="000000"/>
         </w:rPr>
-        <w:t>A gente costuma imaginar o poder como algo que aparece em gritos e ameaças. Mas, muitas vezes, ele aparece de um jeito mais silencioso.</w:t>
+        <w:t>Então aconteceu o detalhe que mais chamou a atenção da imprensa.</w:t>
       </w:r>
     </w:p>
     <w:p>
@@ -303,7 +327,7 @@
         <w:rPr>
           <w:color w:val="000000"/>
         </w:rPr>
-        <w:t>Aparece numa cadeira de diretor, onde se decide quem trabalha e quem espera. Numa nota de poucas linhas, que conta só uma parte da história. Numa ordem judicial que impede uma revista de publicar. E num relógio que continua correndo enquanto todo mundo espera.</w:t>
+        <w:t>Segundo o que foi publicado, o próprio Melhem sugeriu aumentar o valor. De três para cinco salários mínimos. Cerca de oito mil e cem reais.</w:t>
       </w:r>
     </w:p>
     <w:p>
@@ -311,7 +335,7 @@
         <w:rPr>
           <w:color w:val="000000"/>
         </w:rPr>
-        <w:t>Quem está do lado de baixo dessa cadeira aprende cedo a medir cada palavra. Aprende que denunciar pode custar a carreira. E que, mesmo quando decide falar, pode passar anos esperando uma resposta que talvez nunca venha.</w:t>
+        <w:t>O dinheiro vai para o Retiro dos Artistas, a instituição do Rio de Janeiro que acolhe artistas idosos.</w:t>
       </w:r>
     </w:p>
     <w:p>
@@ -319,7 +343,7 @@
         <w:rPr>
           <w:color w:val="000000"/>
         </w:rPr>
-        <w:t>Por isso tantas histórias como essa levam anos para aparecer. E por isso, quando aparecem, quase nunca terminam do jeito que alguém imaginava.</w:t>
+        <w:t>Melhem aceitou o acordo.</w:t>
       </w:r>
     </w:p>
     <w:p>
@@ -327,7 +351,255 @@
         <w:rPr>
           <w:color w:val="000000"/>
         </w:rPr>
-        <w:t>Se esta história te fez pensar em alguém que guarda em silêncio algo assim por medo de perder o emprego, mande este vídeo para essa pessoa hoje.</w:t>
+        <w:t>Com isso, o último processo criminal por assédio sexual contra ele chegou ao fim.</w:t>
+      </w:r>
+    </w:p>
+    <w:p>
+      <w:r>
+        <w:rPr>
+          <w:color w:val="000000"/>
+        </w:rPr>
+        <w:t>Pense no que isso significa.</w:t>
+      </w:r>
+    </w:p>
+    <w:p>
+      <w:r>
+        <w:rPr>
+          <w:color w:val="000000"/>
+        </w:rPr>
+        <w:t>Sete anos depois da primeira queixa de Dani Calabresa dentro da Globo, a história terminou com um pagamento a uma instituição de caridade, sem julgamento do mérito. Nenhum tribunal declarou Melhem culpado. Nenhum tribunal o declarou inocente.</w:t>
+      </w:r>
+    </w:p>
+    <w:p>
+      <w:r>
+        <w:rPr>
+          <w:color w:val="000000"/>
+        </w:rPr>
+        <w:t>A defesa dele continua negando todas as acusações.</w:t>
+      </w:r>
+    </w:p>
+    <w:p>
+      <w:r>
+        <w:rPr>
+          <w:color w:val="000000"/>
+        </w:rPr>
+        <w:t>As mulheres que o acusaram continuam sustentando o que contaram.</w:t>
+      </w:r>
+    </w:p>
+    <w:p>
+      <w:r>
+        <w:rPr>
+          <w:color w:val="000000"/>
+        </w:rPr>
+        <w:t>A pergunta que atravessou toda esta história continua exatamente onde estava.</w:t>
+      </w:r>
+    </w:p>
+    <w:p>
+      <w:r>
+        <w:rPr>
+          <w:color w:val="C00000"/>
+        </w:rPr>
+        <w:t>Só que existe uma coisa que nem esse acordo encerrou. E ela leva de volta ao lugar onde tudo começou. Ao prédio da emissora que, em dois mil e vinte, decidiu que o país não precisava saber o motivo.</w:t>
+      </w:r>
+    </w:p>
+    <w:p>
+      <w:r>
+        <w:rPr>
+          <w:color w:val="000000"/>
+        </w:rPr>
+        <w:t>Até onde se sabe, a Globo nunca tornou público o resultado da investigação interna.</w:t>
+      </w:r>
+    </w:p>
+    <w:p>
+      <w:r>
+        <w:rPr>
+          <w:color w:val="000000"/>
+        </w:rPr>
+        <w:t>O relatório que as mulheres queriam ver nunca foi divulgado ao público. O motivo exato da saída de Marcius Melhem, depois de dezessete anos, continua guardado dentro da emissora.</w:t>
+      </w:r>
+    </w:p>
+    <w:p>
+      <w:r>
+        <w:rPr>
+          <w:color w:val="000000"/>
+        </w:rPr>
+        <w:t>Quando o caso explodiu, a Globo disse que as razões não seriam tornadas públicas.</w:t>
+      </w:r>
+    </w:p>
+    <w:p>
+      <w:r>
+        <w:rPr>
+          <w:color w:val="000000"/>
+        </w:rPr>
+        <w:t>E não foram.</w:t>
+      </w:r>
+    </w:p>
+    <w:p>
+      <w:r>
+        <w:rPr>
+          <w:color w:val="000000"/>
+        </w:rPr>
+        <w:t>Em seis anos de processos e mensagens expostas, a empresa que conduziu a primeira investigação, ouvindo as pessoas na época dos fatos, escolheu ficar em silêncio.</w:t>
+      </w:r>
+    </w:p>
+    <w:p>
+      <w:r>
+        <w:rPr>
+          <w:color w:val="C00000"/>
+        </w:rPr>
+        <w:t>A história ainda não acabou por completo. Daqui a poucos dias, os nomes de Marcius Melhem e Dani Calabresa vão estar de novo frente a frente num tribunal, num processo que nasceu da forma como ele escolheu se defender.</w:t>
+      </w:r>
+    </w:p>
+    <w:p>
+      <w:r>
+        <w:rPr>
+          <w:color w:val="000000"/>
+        </w:rPr>
+        <w:t>O processo por violência psicológica e perseguição, movido por Dani Calabresa e outras três mulheres contra Melhem e Feltrin, continua aberto. A audiência de instrução e julgamento está marcada para vinte e dois de outubro de dois mil e vinte e seis.</w:t>
+      </w:r>
+    </w:p>
+    <w:p>
+      <w:r>
+        <w:rPr>
+          <w:color w:val="000000"/>
+        </w:rPr>
+        <w:t>Melhem e Feltrin negam as acusações. A defesa de Melhem afirma que ele só precisava se defender de acusações feitas em público.</w:t>
+      </w:r>
+    </w:p>
+    <w:p>
+      <w:r>
+        <w:rPr>
+          <w:color w:val="000000"/>
+        </w:rPr>
+        <w:t>O que vai sair dessa audiência, ninguém sabe.</w:t>
+      </w:r>
+    </w:p>
+    <w:p>
+      <w:r>
+        <w:rPr>
+          <w:color w:val="000000"/>
+        </w:rPr>
+        <w:t>Agora volte ao começo.</w:t>
+      </w:r>
+    </w:p>
+    <w:p>
+      <w:r>
+        <w:rPr>
+          <w:color w:val="000000"/>
+        </w:rPr>
+        <w:t>Um estudante de jornalismo que entrou numa aula de teatro por acaso. Que virou ator e depois diretor. Que dividiu o palco com Leandro Hassum e o texto com Marcelo Adnet. Que foi indicado ao Emmy Internacional e chegou ao cargo mais alto do humor da maior emissora do país.</w:t>
+      </w:r>
+    </w:p>
+    <w:p>
+      <w:r>
+        <w:rPr>
+          <w:color w:val="000000"/>
+        </w:rPr>
+        <w:t>E uma humorista que deixou a MTV, passou pelo CQC e aceitou o convite da Globo para trabalhar no programa que ele comandava.</w:t>
+      </w:r>
+    </w:p>
+    <w:p>
+      <w:r>
+        <w:rPr>
+          <w:color w:val="000000"/>
+        </w:rPr>
+        <w:t>Os dois saíram dessa história marcados.</w:t>
+      </w:r>
+    </w:p>
+    <w:p>
+      <w:r>
+        <w:rPr>
+          <w:color w:val="000000"/>
+        </w:rPr>
+        <w:t>Até onde se sabe, Melhem não voltou a ocupar na televisão um cargo como o que teve na Globo. Dani passou anos sendo questionada sobre cada mensagem que mandou para o chefe.</w:t>
+      </w:r>
+    </w:p>
+    <w:p>
+      <w:r>
+        <w:rPr>
+          <w:color w:val="000000"/>
+        </w:rPr>
+        <w:t>No meio deles, ficaram dezenas de pessoas que trabalharam naquele departamento e que, segundo os relatos, passaram anos sem saber se podiam falar.</w:t>
+      </w:r>
+    </w:p>
+    <w:p>
+      <w:r>
+        <w:rPr>
+          <w:color w:val="000000"/>
+        </w:rPr>
+        <w:t>Talvez essa seja a parte mais difícil de toda esta história.</w:t>
+      </w:r>
+    </w:p>
+    <w:p>
+      <w:r>
+        <w:rPr>
+          <w:color w:val="000000"/>
+        </w:rPr>
+        <w:t>A Justiça não deu uma resposta, e a emissora escolheu não dar. Cada pessoa que acompanhou o caso acabou ficando com a versão em que já acreditava antes.</w:t>
+      </w:r>
+    </w:p>
+    <w:p>
+      <w:r>
+        <w:rPr>
+          <w:color w:val="000000"/>
+        </w:rPr>
+        <w:t>Só que existe uma coisa que essa história mostra com clareza, seja qual for a verdade sobre o que aconteceu naquele departamento.</w:t>
+      </w:r>
+    </w:p>
+    <w:p>
+      <w:r>
+        <w:rPr>
+          <w:color w:val="000000"/>
+        </w:rPr>
+        <w:t>Quando uma pessoa tem o poder de decidir o futuro de outra, falar custa caro. Pode custar a carreira e, às vezes, anos de vida dentro de um tribunal. É por isso que tanta gente, em tantos lugares de trabalho, ainda escolhe o silêncio.</w:t>
+      </w:r>
+    </w:p>
+    <w:p>
+      <w:r>
+        <w:rPr>
+          <w:color w:val="000000"/>
+        </w:rPr>
+        <w:t>Se você está passando por uma situação de assédio no trabalho, saiba que existe ajuda. O Ligue cento e oitenta, a Central de Atendimento à Mulher, funciona vinte e quatro horas por dia, de graça.</w:t>
+      </w:r>
+    </w:p>
+    <w:p>
+      <w:r>
+        <w:rPr>
+          <w:color w:val="000000"/>
+        </w:rPr>
+        <w:t>Agora eu quero ouvir você.</w:t>
+      </w:r>
+    </w:p>
+    <w:p>
+      <w:r>
+        <w:rPr>
+          <w:color w:val="000000"/>
+        </w:rPr>
+        <w:t>Se em algum momento da vida você já ficou calado no trabalho por medo de perder o emprego, ou conhece alguém que passou por isso, escreva nos comentários. Sem citar nomes. Só a sua história. Porque é assim, uma voz de cada vez, que esse silêncio começa a mudar. E, se essa história mexeu com você, se inscreva no canal, porque toda semana tem uma nova história que a televisão preferiu não contar.</w:t>
+      </w:r>
+    </w:p>
+    <w:p>
+      <w:r>
+        <w:rPr>
+          <w:color w:val="000000"/>
+        </w:rPr>
+        <w:t>Marcius Melhem deixou a Globo em agosto de dois mil e vinte, depois de dezessete anos.</w:t>
+      </w:r>
+    </w:p>
+    <w:p>
+      <w:r>
+        <w:rPr>
+          <w:color w:val="000000"/>
+        </w:rPr>
+        <w:t>Seis anos depois, o processo acabou.</w:t>
+      </w:r>
+    </w:p>
+    <w:p>
+      <w:r>
+        <w:rPr>
+          <w:color w:val="000000"/>
+        </w:rPr>
+        <w:t>O motivo verdadeiro daquela saída continua dentro da emissora.</w:t>
       </w:r>
     </w:p>
     <w:sectPr>

</xml_diff>